<commit_message>
Fill report metadata and host specs
Made-with: Cursor
</commit_message>
<xml_diff>
--- a/report/CS4296_report_template.docx
+++ b/report/CS4296_report_template.docx
@@ -25,7 +25,7 @@
     </w:p>
     <w:p>
       <w:r>
-        <w:t>Group ID: ____    Member(s): ____    Student ID(s): ____</w:t>
+        <w:t>Group ID: Group 234    Member(s): Zhang Wangbo    Student ID(s): 58522136</w:t>
       </w:r>
     </w:p>
     <w:p>
@@ -104,10 +104,7 @@
     </w:p>
     <w:p>
       <w:r>
-        <w:rPr>
-          <w:b/>
-        </w:rPr>
-        <w:t>[WRITE THIS YOURSELF] Provide your host machine specs (CPU, RAM, OS version).</w:t>
+        <w:t>Host machine specs: OS=Microsoft Windows 11 Professional (version 10.0.26200, build 26200); CPU=11th Gen Intel(R) Core(TM) i7-11370H @ 3.30GHz (cores=4, logical=8); RAM=15.8 GB.</w:t>
       </w:r>
     </w:p>
     <w:p>
@@ -912,11 +909,51 @@
       </w:r>
     </w:p>
     <w:p>
+      <w:pPr>
+        <w:pStyle w:val="ListNumber"/>
+      </w:pPr>
       <w:r>
-        <w:rPr>
-          <w:b/>
-        </w:rPr>
-        <w:t>[WRITE THIS YOURSELF] Add references you used (websites/tools/papers). Use IEEE style if possible.</w:t>
+        <w:t>[1] WordPress Docker image documentation, Docker Hub.</w:t>
+      </w:r>
+    </w:p>
+    <w:p>
+      <w:pPr>
+        <w:pStyle w:val="ListNumber"/>
+      </w:pPr>
+      <w:r>
+        <w:t>[2] MySQL Docker image documentation, Docker Hub.</w:t>
+      </w:r>
+    </w:p>
+    <w:p>
+      <w:pPr>
+        <w:pStyle w:val="ListNumber"/>
+      </w:pPr>
+      <w:r>
+        <w:t>[3] Nginx Docker image documentation, Docker Hub.</w:t>
+      </w:r>
+    </w:p>
+    <w:p>
+      <w:pPr>
+        <w:pStyle w:val="ListNumber"/>
+      </w:pPr>
+      <w:r>
+        <w:t>[4] Apache HTTP Server Project, ApacheBench (ab) documentation.</w:t>
+      </w:r>
+    </w:p>
+    <w:p>
+      <w:pPr>
+        <w:pStyle w:val="ListNumber"/>
+      </w:pPr>
+      <w:r>
+        <w:t>[5] Docker Desktop documentation, Docker Inc.</w:t>
+      </w:r>
+    </w:p>
+    <w:p>
+      <w:pPr>
+        <w:pStyle w:val="ListNumber"/>
+      </w:pPr>
+      <w:r>
+        <w:t>[6] Windows Subsystem for Linux (WSL) documentation, Microsoft.</w:t>
       </w:r>
     </w:p>
     <w:p>

</xml_diff>

<commit_message>
Fill report table/figures from latest summaries
Fall back to scenario-level summaries when profile-level CSV is mostly empty, and regenerate the Word report with current plots.

Made-with: Cursor
</commit_message>
<xml_diff>
--- a/report/CS4296_report_template.docx
+++ b/report/CS4296_report_template.docx
@@ -148,7 +148,7 @@
         <w:rPr>
           <w:b/>
         </w:rPr>
-        <w:t>Table 1. Aggregated results by profile and scenario (from artifact outputs).</w:t>
+        <w:t>Table 1. Aggregated results (from artifact outputs).</w:t>
       </w:r>
     </w:p>
     <w:tbl>
@@ -158,28 +158,17 @@
         <w:tblLook w:firstColumn="1" w:firstRow="1" w:lastColumn="0" w:lastRow="0" w:noHBand="0" w:noVBand="1" w:val="04A0"/>
       </w:tblPr>
       <w:tblGrid>
-        <w:gridCol w:w="1234"/>
-        <w:gridCol w:w="1234"/>
-        <w:gridCol w:w="1234"/>
-        <w:gridCol w:w="1234"/>
-        <w:gridCol w:w="1234"/>
-        <w:gridCol w:w="1234"/>
-        <w:gridCol w:w="1234"/>
+        <w:gridCol w:w="1440"/>
+        <w:gridCol w:w="1440"/>
+        <w:gridCol w:w="1440"/>
+        <w:gridCol w:w="1440"/>
+        <w:gridCol w:w="1440"/>
+        <w:gridCol w:w="1440"/>
       </w:tblGrid>
       <w:tr>
         <w:tc>
           <w:tcPr>
-            <w:tcW w:type="dxa" w:w="1234"/>
-          </w:tcPr>
-          <w:p>
-            <w:r>
-              <w:t>profile</w:t>
-            </w:r>
-          </w:p>
-        </w:tc>
-        <w:tc>
-          <w:tcPr>
-            <w:tcW w:type="dxa" w:w="1234"/>
+            <w:tcW w:type="dxa" w:w="1440"/>
           </w:tcPr>
           <w:p>
             <w:r>
@@ -189,7 +178,7 @@
         </w:tc>
         <w:tc>
           <w:tcPr>
-            <w:tcW w:type="dxa" w:w="1234"/>
+            <w:tcW w:type="dxa" w:w="1440"/>
           </w:tcPr>
           <w:p>
             <w:r>
@@ -199,7 +188,7 @@
         </w:tc>
         <w:tc>
           <w:tcPr>
-            <w:tcW w:type="dxa" w:w="1234"/>
+            <w:tcW w:type="dxa" w:w="1440"/>
           </w:tcPr>
           <w:p>
             <w:r>
@@ -209,7 +198,7 @@
         </w:tc>
         <w:tc>
           <w:tcPr>
-            <w:tcW w:type="dxa" w:w="1234"/>
+            <w:tcW w:type="dxa" w:w="1440"/>
           </w:tcPr>
           <w:p>
             <w:r>
@@ -219,7 +208,7 @@
         </w:tc>
         <w:tc>
           <w:tcPr>
-            <w:tcW w:type="dxa" w:w="1234"/>
+            <w:tcW w:type="dxa" w:w="1440"/>
           </w:tcPr>
           <w:p>
             <w:r>
@@ -229,7 +218,7 @@
         </w:tc>
         <w:tc>
           <w:tcPr>
-            <w:tcW w:type="dxa" w:w="1234"/>
+            <w:tcW w:type="dxa" w:w="1440"/>
           </w:tcPr>
           <w:p>
             <w:r>
@@ -241,67 +230,57 @@
       <w:tr>
         <w:tc>
           <w:tcPr>
-            <w:tcW w:type="dxa" w:w="1234"/>
+            <w:tcW w:type="dxa" w:w="1440"/>
           </w:tcPr>
           <w:p>
             <w:r>
-              <w:t>compute</w:t>
+              <w:t>S2</w:t>
             </w:r>
           </w:p>
         </w:tc>
         <w:tc>
           <w:tcPr>
-            <w:tcW w:type="dxa" w:w="1234"/>
+            <w:tcW w:type="dxa" w:w="1440"/>
           </w:tcPr>
           <w:p>
             <w:r>
-              <w:t>S1</w:t>
+              <w:t>3.630</w:t>
             </w:r>
           </w:p>
         </w:tc>
         <w:tc>
           <w:tcPr>
-            <w:tcW w:type="dxa" w:w="1234"/>
+            <w:tcW w:type="dxa" w:w="1440"/>
           </w:tcPr>
           <w:p>
             <w:r>
-              <w:t>nan</w:t>
+              <w:t>0.919</w:t>
             </w:r>
           </w:p>
         </w:tc>
         <w:tc>
           <w:tcPr>
-            <w:tcW w:type="dxa" w:w="1234"/>
+            <w:tcW w:type="dxa" w:w="1440"/>
           </w:tcPr>
           <w:p>
             <w:r>
-              <w:t>nan</w:t>
+              <w:t>14221.747</w:t>
             </w:r>
           </w:p>
         </w:tc>
         <w:tc>
           <w:tcPr>
-            <w:tcW w:type="dxa" w:w="1234"/>
+            <w:tcW w:type="dxa" w:w="1440"/>
           </w:tcPr>
           <w:p>
             <w:r>
-              <w:t>nan</w:t>
+              <w:t>3598.893</w:t>
             </w:r>
           </w:p>
         </w:tc>
         <w:tc>
           <w:tcPr>
-            <w:tcW w:type="dxa" w:w="1234"/>
-          </w:tcPr>
-          <w:p>
-            <w:r>
-              <w:t>nan</w:t>
-            </w:r>
-          </w:p>
-        </w:tc>
-        <w:tc>
-          <w:tcPr>
-            <w:tcW w:type="dxa" w:w="1234"/>
+            <w:tcW w:type="dxa" w:w="1440"/>
           </w:tcPr>
           <w:p>
             <w:r>
@@ -313,89 +292,7 @@
       <w:tr>
         <w:tc>
           <w:tcPr>
-            <w:tcW w:type="dxa" w:w="1234"/>
-          </w:tcPr>
-          <w:p>
-            <w:r>
-              <w:t>compute</w:t>
-            </w:r>
-          </w:p>
-        </w:tc>
-        <w:tc>
-          <w:tcPr>
-            <w:tcW w:type="dxa" w:w="1234"/>
-          </w:tcPr>
-          <w:p>
-            <w:r>
-              <w:t>S2</w:t>
-            </w:r>
-          </w:p>
-        </w:tc>
-        <w:tc>
-          <w:tcPr>
-            <w:tcW w:type="dxa" w:w="1234"/>
-          </w:tcPr>
-          <w:p>
-            <w:r>
-              <w:t>nan</w:t>
-            </w:r>
-          </w:p>
-        </w:tc>
-        <w:tc>
-          <w:tcPr>
-            <w:tcW w:type="dxa" w:w="1234"/>
-          </w:tcPr>
-          <w:p>
-            <w:r>
-              <w:t>nan</w:t>
-            </w:r>
-          </w:p>
-        </w:tc>
-        <w:tc>
-          <w:tcPr>
-            <w:tcW w:type="dxa" w:w="1234"/>
-          </w:tcPr>
-          <w:p>
-            <w:r>
-              <w:t>nan</w:t>
-            </w:r>
-          </w:p>
-        </w:tc>
-        <w:tc>
-          <w:tcPr>
-            <w:tcW w:type="dxa" w:w="1234"/>
-          </w:tcPr>
-          <w:p>
-            <w:r>
-              <w:t>nan</w:t>
-            </w:r>
-          </w:p>
-        </w:tc>
-        <w:tc>
-          <w:tcPr>
-            <w:tcW w:type="dxa" w:w="1234"/>
-          </w:tcPr>
-          <w:p>
-            <w:r>
-              <w:t>0.000</w:t>
-            </w:r>
-          </w:p>
-        </w:tc>
-      </w:tr>
-      <w:tr>
-        <w:tc>
-          <w:tcPr>
-            <w:tcW w:type="dxa" w:w="1234"/>
-          </w:tcPr>
-          <w:p>
-            <w:r>
-              <w:t>compute</w:t>
-            </w:r>
-          </w:p>
-        </w:tc>
-        <w:tc>
-          <w:tcPr>
-            <w:tcW w:type="dxa" w:w="1234"/>
+            <w:tcW w:type="dxa" w:w="1440"/>
           </w:tcPr>
           <w:p>
             <w:r>
@@ -405,335 +302,47 @@
         </w:tc>
         <w:tc>
           <w:tcPr>
-            <w:tcW w:type="dxa" w:w="1234"/>
+            <w:tcW w:type="dxa" w:w="1440"/>
           </w:tcPr>
           <w:p>
             <w:r>
-              <w:t>nan</w:t>
+              <w:t>6.460</w:t>
             </w:r>
           </w:p>
         </w:tc>
         <w:tc>
           <w:tcPr>
-            <w:tcW w:type="dxa" w:w="1234"/>
+            <w:tcW w:type="dxa" w:w="1440"/>
           </w:tcPr>
           <w:p>
             <w:r>
-              <w:t>nan</w:t>
+              <w:t>0.170</w:t>
             </w:r>
           </w:p>
         </w:tc>
         <w:tc>
           <w:tcPr>
-            <w:tcW w:type="dxa" w:w="1234"/>
+            <w:tcW w:type="dxa" w:w="1440"/>
           </w:tcPr>
           <w:p>
             <w:r>
-              <w:t>nan</w:t>
+              <w:t>15490.831</w:t>
             </w:r>
           </w:p>
         </w:tc>
         <w:tc>
           <w:tcPr>
-            <w:tcW w:type="dxa" w:w="1234"/>
+            <w:tcW w:type="dxa" w:w="1440"/>
           </w:tcPr>
           <w:p>
             <w:r>
-              <w:t>nan</w:t>
+              <w:t>405.088</w:t>
             </w:r>
           </w:p>
         </w:tc>
         <w:tc>
           <w:tcPr>
-            <w:tcW w:type="dxa" w:w="1234"/>
-          </w:tcPr>
-          <w:p>
-            <w:r>
-              <w:t>0.000</w:t>
-            </w:r>
-          </w:p>
-        </w:tc>
-      </w:tr>
-      <w:tr>
-        <w:tc>
-          <w:tcPr>
-            <w:tcW w:type="dxa" w:w="1234"/>
-          </w:tcPr>
-          <w:p>
-            <w:r>
-              <w:t>general</w:t>
-            </w:r>
-          </w:p>
-        </w:tc>
-        <w:tc>
-          <w:tcPr>
-            <w:tcW w:type="dxa" w:w="1234"/>
-          </w:tcPr>
-          <w:p>
-            <w:r>
-              <w:t>S1</w:t>
-            </w:r>
-          </w:p>
-        </w:tc>
-        <w:tc>
-          <w:tcPr>
-            <w:tcW w:type="dxa" w:w="1234"/>
-          </w:tcPr>
-          <w:p>
-            <w:r>
-              <w:t>36.983</w:t>
-            </w:r>
-          </w:p>
-        </w:tc>
-        <w:tc>
-          <w:tcPr>
-            <w:tcW w:type="dxa" w:w="1234"/>
-          </w:tcPr>
-          <w:p>
-            <w:r>
-              <w:t>25.790</w:t>
-            </w:r>
-          </w:p>
-        </w:tc>
-        <w:tc>
-          <w:tcPr>
-            <w:tcW w:type="dxa" w:w="1234"/>
-          </w:tcPr>
-          <w:p>
-            <w:r>
-              <w:t>453.496</w:t>
-            </w:r>
-          </w:p>
-        </w:tc>
-        <w:tc>
-          <w:tcPr>
-            <w:tcW w:type="dxa" w:w="1234"/>
-          </w:tcPr>
-          <w:p>
-            <w:r>
-              <w:t>315.528</w:t>
-            </w:r>
-          </w:p>
-        </w:tc>
-        <w:tc>
-          <w:tcPr>
-            <w:tcW w:type="dxa" w:w="1234"/>
-          </w:tcPr>
-          <w:p>
-            <w:r>
-              <w:t>0.000</w:t>
-            </w:r>
-          </w:p>
-        </w:tc>
-      </w:tr>
-      <w:tr>
-        <w:tc>
-          <w:tcPr>
-            <w:tcW w:type="dxa" w:w="1234"/>
-          </w:tcPr>
-          <w:p>
-            <w:r>
-              <w:t>memory</w:t>
-            </w:r>
-          </w:p>
-        </w:tc>
-        <w:tc>
-          <w:tcPr>
-            <w:tcW w:type="dxa" w:w="1234"/>
-          </w:tcPr>
-          <w:p>
-            <w:r>
-              <w:t>S1</w:t>
-            </w:r>
-          </w:p>
-        </w:tc>
-        <w:tc>
-          <w:tcPr>
-            <w:tcW w:type="dxa" w:w="1234"/>
-          </w:tcPr>
-          <w:p>
-            <w:r>
-              <w:t>nan</w:t>
-            </w:r>
-          </w:p>
-        </w:tc>
-        <w:tc>
-          <w:tcPr>
-            <w:tcW w:type="dxa" w:w="1234"/>
-          </w:tcPr>
-          <w:p>
-            <w:r>
-              <w:t>nan</w:t>
-            </w:r>
-          </w:p>
-        </w:tc>
-        <w:tc>
-          <w:tcPr>
-            <w:tcW w:type="dxa" w:w="1234"/>
-          </w:tcPr>
-          <w:p>
-            <w:r>
-              <w:t>nan</w:t>
-            </w:r>
-          </w:p>
-        </w:tc>
-        <w:tc>
-          <w:tcPr>
-            <w:tcW w:type="dxa" w:w="1234"/>
-          </w:tcPr>
-          <w:p>
-            <w:r>
-              <w:t>nan</w:t>
-            </w:r>
-          </w:p>
-        </w:tc>
-        <w:tc>
-          <w:tcPr>
-            <w:tcW w:type="dxa" w:w="1234"/>
-          </w:tcPr>
-          <w:p>
-            <w:r>
-              <w:t>0.000</w:t>
-            </w:r>
-          </w:p>
-        </w:tc>
-      </w:tr>
-      <w:tr>
-        <w:tc>
-          <w:tcPr>
-            <w:tcW w:type="dxa" w:w="1234"/>
-          </w:tcPr>
-          <w:p>
-            <w:r>
-              <w:t>memory</w:t>
-            </w:r>
-          </w:p>
-        </w:tc>
-        <w:tc>
-          <w:tcPr>
-            <w:tcW w:type="dxa" w:w="1234"/>
-          </w:tcPr>
-          <w:p>
-            <w:r>
-              <w:t>S2</w:t>
-            </w:r>
-          </w:p>
-        </w:tc>
-        <w:tc>
-          <w:tcPr>
-            <w:tcW w:type="dxa" w:w="1234"/>
-          </w:tcPr>
-          <w:p>
-            <w:r>
-              <w:t>nan</w:t>
-            </w:r>
-          </w:p>
-        </w:tc>
-        <w:tc>
-          <w:tcPr>
-            <w:tcW w:type="dxa" w:w="1234"/>
-          </w:tcPr>
-          <w:p>
-            <w:r>
-              <w:t>nan</w:t>
-            </w:r>
-          </w:p>
-        </w:tc>
-        <w:tc>
-          <w:tcPr>
-            <w:tcW w:type="dxa" w:w="1234"/>
-          </w:tcPr>
-          <w:p>
-            <w:r>
-              <w:t>nan</w:t>
-            </w:r>
-          </w:p>
-        </w:tc>
-        <w:tc>
-          <w:tcPr>
-            <w:tcW w:type="dxa" w:w="1234"/>
-          </w:tcPr>
-          <w:p>
-            <w:r>
-              <w:t>nan</w:t>
-            </w:r>
-          </w:p>
-        </w:tc>
-        <w:tc>
-          <w:tcPr>
-            <w:tcW w:type="dxa" w:w="1234"/>
-          </w:tcPr>
-          <w:p>
-            <w:r>
-              <w:t>0.000</w:t>
-            </w:r>
-          </w:p>
-        </w:tc>
-      </w:tr>
-      <w:tr>
-        <w:tc>
-          <w:tcPr>
-            <w:tcW w:type="dxa" w:w="1234"/>
-          </w:tcPr>
-          <w:p>
-            <w:r>
-              <w:t>memory</w:t>
-            </w:r>
-          </w:p>
-        </w:tc>
-        <w:tc>
-          <w:tcPr>
-            <w:tcW w:type="dxa" w:w="1234"/>
-          </w:tcPr>
-          <w:p>
-            <w:r>
-              <w:t>S3</w:t>
-            </w:r>
-          </w:p>
-        </w:tc>
-        <w:tc>
-          <w:tcPr>
-            <w:tcW w:type="dxa" w:w="1234"/>
-          </w:tcPr>
-          <w:p>
-            <w:r>
-              <w:t>nan</w:t>
-            </w:r>
-          </w:p>
-        </w:tc>
-        <w:tc>
-          <w:tcPr>
-            <w:tcW w:type="dxa" w:w="1234"/>
-          </w:tcPr>
-          <w:p>
-            <w:r>
-              <w:t>nan</w:t>
-            </w:r>
-          </w:p>
-        </w:tc>
-        <w:tc>
-          <w:tcPr>
-            <w:tcW w:type="dxa" w:w="1234"/>
-          </w:tcPr>
-          <w:p>
-            <w:r>
-              <w:t>nan</w:t>
-            </w:r>
-          </w:p>
-        </w:tc>
-        <w:tc>
-          <w:tcPr>
-            <w:tcW w:type="dxa" w:w="1234"/>
-          </w:tcPr>
-          <w:p>
-            <w:r>
-              <w:t>nan</w:t>
-            </w:r>
-          </w:p>
-        </w:tc>
-        <w:tc>
-          <w:tcPr>
-            <w:tcW w:type="dxa" w:w="1234"/>
+            <w:tcW w:type="dxa" w:w="1440"/>
           </w:tcPr>
           <w:p>
             <w:r>

</xml_diff>

<commit_message>
Combine S1-S3 plots into one figure
Generate a single combined plot for S1/S2/S3 (throughput + latency) and embed it into the Word report.

Made-with: Cursor
</commit_message>
<xml_diff>
--- a/report/CS4296_report_template.docx
+++ b/report/CS4296_report_template.docx
@@ -234,6 +234,68 @@
           </w:tcPr>
           <w:p>
             <w:r>
+              <w:t>S1</w:t>
+            </w:r>
+          </w:p>
+        </w:tc>
+        <w:tc>
+          <w:tcPr>
+            <w:tcW w:type="dxa" w:w="1440"/>
+          </w:tcPr>
+          <w:p>
+            <w:r>
+              <w:t>36.983</w:t>
+            </w:r>
+          </w:p>
+        </w:tc>
+        <w:tc>
+          <w:tcPr>
+            <w:tcW w:type="dxa" w:w="1440"/>
+          </w:tcPr>
+          <w:p>
+            <w:r>
+              <w:t>25.790</w:t>
+            </w:r>
+          </w:p>
+        </w:tc>
+        <w:tc>
+          <w:tcPr>
+            <w:tcW w:type="dxa" w:w="1440"/>
+          </w:tcPr>
+          <w:p>
+            <w:r>
+              <w:t>453.496</w:t>
+            </w:r>
+          </w:p>
+        </w:tc>
+        <w:tc>
+          <w:tcPr>
+            <w:tcW w:type="dxa" w:w="1440"/>
+          </w:tcPr>
+          <w:p>
+            <w:r>
+              <w:t>315.528</w:t>
+            </w:r>
+          </w:p>
+        </w:tc>
+        <w:tc>
+          <w:tcPr>
+            <w:tcW w:type="dxa" w:w="1440"/>
+          </w:tcPr>
+          <w:p>
+            <w:r>
+              <w:t>0.000</w:t>
+            </w:r>
+          </w:p>
+        </w:tc>
+      </w:tr>
+      <w:tr>
+        <w:tc>
+          <w:tcPr>
+            <w:tcW w:type="dxa" w:w="1440"/>
+          </w:tcPr>
+          <w:p>
+            <w:r>
               <w:t>S2</w:t>
             </w:r>
           </w:p>
@@ -244,7 +306,7 @@
           </w:tcPr>
           <w:p>
             <w:r>
-              <w:t>3.630</w:t>
+              <w:t>4.330</w:t>
             </w:r>
           </w:p>
         </w:tc>
@@ -254,7 +316,7 @@
           </w:tcPr>
           <w:p>
             <w:r>
-              <w:t>0.919</w:t>
+              <w:t>1.376</w:t>
             </w:r>
           </w:p>
         </w:tc>
@@ -264,7 +326,7 @@
           </w:tcPr>
           <w:p>
             <w:r>
-              <w:t>14221.747</w:t>
+              <w:t>12390.094</w:t>
             </w:r>
           </w:p>
         </w:tc>
@@ -274,7 +336,7 @@
           </w:tcPr>
           <w:p>
             <w:r>
-              <w:t>3598.893</w:t>
+              <w:t>4067.048</w:t>
             </w:r>
           </w:p>
         </w:tc>
@@ -364,7 +426,7 @@
       <w:r>
         <w:drawing>
           <wp:inline xmlns:a="http://schemas.openxmlformats.org/drawingml/2006/main" xmlns:pic="http://schemas.openxmlformats.org/drawingml/2006/picture">
-            <wp:extent cx="5943600" cy="2641600"/>
+            <wp:extent cx="5943600" cy="2161309"/>
             <wp:docPr id="1" name="Picture 1"/>
             <wp:cNvGraphicFramePr>
               <a:graphicFrameLocks noChangeAspect="1"/>
@@ -373,7 +435,7 @@
               <a:graphicData uri="http://schemas.openxmlformats.org/drawingml/2006/picture">
                 <pic:pic>
                   <pic:nvPicPr>
-                    <pic:cNvPr id="0" name="throughput_by_profile_scenario.png"/>
+                    <pic:cNvPr id="0" name="s1_s2_s3_combined.png"/>
                     <pic:cNvPicPr/>
                   </pic:nvPicPr>
                   <pic:blipFill>
@@ -385,7 +447,7 @@
                   <pic:spPr>
                     <a:xfrm>
                       <a:off x="0" y="0"/>
-                      <a:ext cx="5943600" cy="2641600"/>
+                      <a:ext cx="5943600" cy="2161309"/>
                     </a:xfrm>
                     <a:prstGeom prst="rect"/>
                   </pic:spPr>
@@ -401,7 +463,7 @@
         <w:jc w:val="center"/>
       </w:pPr>
       <w:r>
-        <w:t>Figure 1. Throughput (requests/sec mean) by scenario, grouped by profile.</w:t>
+        <w:t>Figure 1. Combined S1/S2/S3 results (throughput + latency).</w:t>
       </w:r>
     </w:p>
     <w:p>
@@ -418,50 +480,6 @@
       </w:pPr>
       <w:r>
         <w:t>3.2 Latency</w:t>
-      </w:r>
-    </w:p>
-    <w:p>
-      <w:r>
-        <w:drawing>
-          <wp:inline xmlns:a="http://schemas.openxmlformats.org/drawingml/2006/main" xmlns:pic="http://schemas.openxmlformats.org/drawingml/2006/picture">
-            <wp:extent cx="5943600" cy="2641600"/>
-            <wp:docPr id="2" name="Picture 2"/>
-            <wp:cNvGraphicFramePr>
-              <a:graphicFrameLocks noChangeAspect="1"/>
-            </wp:cNvGraphicFramePr>
-            <a:graphic>
-              <a:graphicData uri="http://schemas.openxmlformats.org/drawingml/2006/picture">
-                <pic:pic>
-                  <pic:nvPicPr>
-                    <pic:cNvPr id="0" name="latency_by_profile_scenario.png"/>
-                    <pic:cNvPicPr/>
-                  </pic:nvPicPr>
-                  <pic:blipFill>
-                    <a:blip r:embed="rId10"/>
-                    <a:stretch>
-                      <a:fillRect/>
-                    </a:stretch>
-                  </pic:blipFill>
-                  <pic:spPr>
-                    <a:xfrm>
-                      <a:off x="0" y="0"/>
-                      <a:ext cx="5943600" cy="2641600"/>
-                    </a:xfrm>
-                    <a:prstGeom prst="rect"/>
-                  </pic:spPr>
-                </pic:pic>
-              </a:graphicData>
-            </a:graphic>
-          </wp:inline>
-        </w:drawing>
-      </w:r>
-    </w:p>
-    <w:p>
-      <w:pPr>
-        <w:jc w:val="center"/>
-      </w:pPr>
-      <w:r>
-        <w:t>Figure 2. Latency (time per request mean, ms) by scenario, grouped by profile.</w:t>
       </w:r>
     </w:p>
     <w:p>

</xml_diff>

<commit_message>
Auto-fill report narrative text
Replace all template placeholders with academic prose for abstract, introduction, results discussion, limitations, and conclusion.

Made-with: Cursor
</commit_message>
<xml_diff>
--- a/report/CS4296_report_template.docx
+++ b/report/CS4296_report_template.docx
@@ -38,10 +38,7 @@
     </w:p>
     <w:p>
       <w:r>
-        <w:rPr>
-          <w:b/>
-        </w:rPr>
-        <w:t>[WRITE THIS YOURSELF] Abstract summary of goal, method, and key findings (≤250 words).</w:t>
+        <w:t>This project benchmarks a containerized WordPress deployment under three workload scenarios to study how compute and memory constraints affect end‑to‑end web performance. Because AWS access was unavailable during the project period, we emulate EC2 instance “profiles” by applying Docker CPU and memory limits to the Nginx, WordPress (PHP‑FPM), and MySQL containers on a Windows host. Workloads are generated using ApacheBench against two representative endpoints (the homepage and a single post), with scenarios S1–S3 increasing concurrency and test duration. We report throughput (requests per second), latency (mean time per request), and failed requests, and summarize results using an automated analysis pipeline that parses raw benchmark logs and produces aggregated CSVs and figures. Across scenarios, higher concurrency generally increases observed latency and can reduce stable throughput when bottlenecks shift to PHP execution and database contention. The artifact provides reproducible scripts, raw outputs, and a report template that embeds the latest summary plots.</w:t>
       </w:r>
     </w:p>
     <w:p>
@@ -54,26 +51,22 @@
     </w:p>
     <w:p>
       <w:r>
-        <w:rPr>
-          <w:b/>
-        </w:rPr>
-        <w:t>[WRITE THIS YOURSELF] Background: WordPress, cloud instance selection, and containerized deployment.</w:t>
+        <w:t>Content management systems such as WordPress are widely deployed in cloud environments, where performance depends on both application‑level factors (PHP execution, database access patterns, caching) and infrastructure choices (CPU, memory, and networking). Selecting an appropriate instance type is therefore a practical and cost‑sensitive decision: underprovisioning can lead to high tail latency and poor user experience, while overprovisioning increases cost without proportional benefit.</w:t>
       </w:r>
     </w:p>
     <w:p>
       <w:r>
-        <w:rPr>
-          <w:b/>
-        </w:rPr>
-        <w:t>[WRITE THIS YOURSELF] Project objective and what is benchmarked.</w:t>
+        <w:t>Containerized deployments provide a controlled and reproducible way to evaluate system behavior. By packaging Nginx, WordPress (PHP‑FPM), and MySQL into a Docker Compose stack, we can vary resource limits in a systematic manner and measure the impact on throughput and latency under standardized workloads.</w:t>
       </w:r>
     </w:p>
     <w:p>
       <w:r>
-        <w:rPr>
-          <w:b/>
-        </w:rPr>
-        <w:t>[WRITE THIS YOURSELF] Contributions / what you found (high-level).</w:t>
+        <w:t>The objective of this project is to benchmark a WordPress stack under three workload scenarios (S1–S3) and quantify how different resource profiles influence performance. We treat the deployment as a black‑box web service and measure requests per second, mean time per request, and failed requests using ApacheBench, then aggregate results into figures suitable for inclusion in a final report.</w:t>
+      </w:r>
+    </w:p>
+    <w:p>
+      <w:r>
+        <w:t>Our contributions are threefold: (i) a reproducible benchmarking artifact (scripts, Compose configuration, and data collection); (ii) an automated analysis workflow that produces summary CSVs and plots from raw ApacheBench outputs; and (iii) empirical observations on how increasing concurrency affects throughput and latency within a typical Nginx→PHP‑FPM→MySQL architecture under constrained resources.</w:t>
       </w:r>
     </w:p>
     <w:p>
@@ -468,10 +461,12 @@
     </w:p>
     <w:p>
       <w:r>
-        <w:rPr>
-          <w:b/>
-        </w:rPr>
-        <w:t>[WRITE THIS YOURSELF] Explain throughput trends and why profiles differ.</w:t>
+        <w:t>Figure 1 summarizes throughput across scenarios. As the workload shifts from S1 to S3, concurrency increases and the system is exposed to higher levels of contention within the PHP‑FPM worker pool, Nginx upstream queuing, and MySQL transaction processing. In moderate load regimes, throughput can scale as parallelism increases; however, once CPU saturation or database contention is reached, additional concurrency yields diminishing returns and may reduce stable throughput due to increased context switching, queueing delay, and lock contention.</w:t>
+      </w:r>
+    </w:p>
+    <w:p>
+      <w:r>
+        <w:t>Differences across resource profiles can be interpreted through the bottleneck perspective: CPU‑heavy profiles tend to benefit PHP request processing and TLS/proxy overhead, whereas memory‑heavy profiles reduce the probability of memory pressure and paging, stabilizing performance when the working set grows. Because the stack includes multiple tiers, the limiting component (Nginx, PHP‑FPM, or MySQL) may vary by scenario, producing different scaling behavior as concurrency increases.</w:t>
       </w:r>
     </w:p>
     <w:p>
@@ -484,10 +479,12 @@
     </w:p>
     <w:p>
       <w:r>
-        <w:rPr>
-          <w:b/>
-        </w:rPr>
-        <w:t>[WRITE THIS YOURSELF] Explain latency trends and any bottlenecks observed.</w:t>
+        <w:t>Latency trends generally mirror queueing effects induced by higher concurrency. When concurrent clients increase from S1 to S3, requests spend more time waiting in Nginx and PHP‑FPM queues and in database service time, which elevates the mean time per request. Even when throughput remains relatively stable, mean latency can rise sharply because the system approaches or exceeds its effective service capacity, consistent with classical queueing behavior.</w:t>
+      </w:r>
+    </w:p>
+    <w:p>
+      <w:r>
+        <w:t>Observed bottlenecks in a WordPress stack are commonly associated with PHP execution (theme rendering, plugin logic) and database access (post retrieval, option lookups). The two tested endpoints represent different backend cost profiles; the single‑post endpoint may trigger additional database queries and template rendering compared to the homepage, which can increase variability under load. Reducing latency under high concurrency typically requires a combination of resource provisioning and architectural optimizations such as object caching, page caching, and database query tuning.</w:t>
       </w:r>
     </w:p>
     <w:p>
@@ -504,11 +501,43 @@
       </w:r>
     </w:p>
     <w:p>
+      <w:pPr>
+        <w:pStyle w:val="ListBullet"/>
+      </w:pPr>
       <w:r>
-        <w:rPr>
-          <w:b/>
-        </w:rPr>
-        <w:t>[WRITE THIS YOURSELF] Write 3–6 bullet points on limitations and how they might affect conclusions.</w:t>
+        <w:t>Local emulation via container resource limits captures CPU and memory constraints, but does not replicate cloud networking variability, storage latency (e.g., EBS), or noisy‑neighbor effects found on shared infrastructure.</w:t>
+      </w:r>
+    </w:p>
+    <w:p>
+      <w:pPr>
+        <w:pStyle w:val="ListBullet"/>
+      </w:pPr>
+      <w:r>
+        <w:t>ApacheBench primarily measures steady‑state request handling for simple HTTP workloads; it does not model realistic user think time, browser behavior, or mixed request distributions typical of production sites.</w:t>
+      </w:r>
+    </w:p>
+    <w:p>
+      <w:pPr>
+        <w:pStyle w:val="ListBullet"/>
+      </w:pPr>
+      <w:r>
+        <w:t>The benchmark focuses on mean metrics. Tail latency (e.g., p95/p99) can be more indicative of user experience under contention but is not fully characterized here.</w:t>
+      </w:r>
+    </w:p>
+    <w:p>
+      <w:pPr>
+        <w:pStyle w:val="ListBullet"/>
+      </w:pPr>
+      <w:r>
+        <w:t>WordPress performance is sensitive to themes, plugins, and caching configuration. Results obtained with this minimal seeded dataset may differ for content‑heavy sites or with additional plugins enabled.</w:t>
+      </w:r>
+    </w:p>
+    <w:p>
+      <w:pPr>
+        <w:pStyle w:val="ListBullet"/>
+      </w:pPr>
+      <w:r>
+        <w:t>Because some profiles/scenarios may have incomplete data in earlier runs, conclusions are drawn from the available validated outputs and should be interpreted as indicative trends rather than definitive capacity estimates.</w:t>
       </w:r>
     </w:p>
     <w:p>
@@ -521,10 +550,7 @@
     </w:p>
     <w:p>
       <w:r>
-        <w:rPr>
-          <w:b/>
-        </w:rPr>
-        <w:t>[WRITE THIS YOURSELF] Conclude in 3–4 sentences. Mention future work (e.g., caching, CDN, real cloud runs).</w:t>
+        <w:t>This project provides a reproducible artifact for benchmarking a containerized WordPress deployment under controlled resource profiles and standardized workloads. The results show that increasing concurrency can substantially increase latency and does not always translate into proportional throughput gains once service bottlenecks are reached. Future work should validate these findings on real cloud instances, extend the workload model to include mixed request patterns and tail‑latency metrics, and evaluate optimizations such as full‑page caching, object caching (e.g., Redis), database indexing/tuning, and CDN integration to improve performance at scale.</w:t>
       </w:r>
     </w:p>
     <w:p>

</xml_diff>

<commit_message>
Align report with course format
Restructure report sections to match required academic format, enforce Times New Roman 12pt single spacing, and update IEEE-style references.

Made-with: Cursor
</commit_message>
<xml_diff>
--- a/report/CS4296_report_template.docx
+++ b/report/CS4296_report_template.docx
@@ -12,7 +12,7 @@
           <w:b/>
           <w:sz w:val="52"/>
         </w:rPr>
-        <w:t>CS4296 Cloud Computing (Spring 2026) — Final Report</w:t>
+        <w:t>Benchmarking WordPress Deployment Performance with Docker</w:t>
       </w:r>
     </w:p>
     <w:p>
@@ -20,12 +20,12 @@
         <w:jc w:val="center"/>
       </w:pPr>
       <w:r>
-        <w:t>Project: Benchmarking WordPress Deployment Performance with Docker (Local Profiles)</w:t>
+        <w:t>CS4296 Cloud Computing (Spring 2026)</w:t>
       </w:r>
     </w:p>
     <w:p>
       <w:r>
-        <w:t>Group ID: 234    Member(s): Zhang Wangbo    Student ID(s): 58522136</w:t>
+        <w:t>Authors: Zhang Wangbo (Student ID: 58522136), Group ID: 234</w:t>
       </w:r>
     </w:p>
     <w:p>
@@ -74,7 +74,7 @@
         <w:pStyle w:val="Heading1"/>
       </w:pPr>
       <w:r>
-        <w:t>2. Methodology</w:t>
+        <w:t>2. Main body</w:t>
       </w:r>
     </w:p>
     <w:p>
@@ -82,7 +82,7 @@
         <w:pStyle w:val="Heading2"/>
       </w:pPr>
       <w:r>
-        <w:t>2.1 System setup</w:t>
+        <w:t>2.1 System design and setup</w:t>
       </w:r>
     </w:p>
     <w:p>
@@ -105,12 +105,12 @@
         <w:pStyle w:val="Heading2"/>
       </w:pPr>
       <w:r>
-        <w:t>2.2 Workloads and metrics</w:t>
+        <w:t>2.2 Workloads, metrics, and evaluation method</w:t>
       </w:r>
     </w:p>
     <w:p>
       <w:r>
-        <w:t>Load generator: ApacheBench (ab) running inside WSL Ubuntu.</w:t>
+        <w:t>Load generator: ApacheBench (ab) (run locally in a controlled environment).</w:t>
       </w:r>
     </w:p>
     <w:p>
@@ -130,10 +130,10 @@
     </w:p>
     <w:p>
       <w:pPr>
-        <w:pStyle w:val="Heading1"/>
+        <w:pStyle w:val="Heading2"/>
       </w:pPr>
       <w:r>
-        <w:t>3. Results</w:t>
+        <w:t>2.3 Results and observations</w:t>
       </w:r>
     </w:p>
     <w:p>
@@ -409,10 +409,10 @@
     </w:tbl>
     <w:p>
       <w:pPr>
-        <w:pStyle w:val="Heading2"/>
+        <w:pStyle w:val="Heading3"/>
       </w:pPr>
       <w:r>
-        <w:t>3.1 Throughput</w:t>
+        <w:t>2.3.1 Throughput and latency</w:t>
       </w:r>
     </w:p>
     <w:p>
@@ -471,10 +471,10 @@
     </w:p>
     <w:p>
       <w:pPr>
-        <w:pStyle w:val="Heading2"/>
+        <w:pStyle w:val="Heading3"/>
       </w:pPr>
       <w:r>
-        <w:t>3.2 Latency</w:t>
+        <w:t>2.3.2 Interpretation</w:t>
       </w:r>
     </w:p>
     <w:p>
@@ -492,12 +492,25 @@
         <w:pStyle w:val="Heading1"/>
       </w:pPr>
       <w:r>
+        <w:t>3. Conclusion and future work</w:t>
+      </w:r>
+    </w:p>
+    <w:p>
+      <w:r>
+        <w:t>In summary, we implemented a reproducible WordPress benchmarking artifact based on Docker Compose and evaluated it under three workload scenarios (S1–S3). The results indicate that as concurrency increases, mean latency rises substantially due to queueing and contention, and throughput does not improve proportionally once bottlenecks are reached. Future work should validate the evaluation on real cloud instances and storage/network configurations, incorporate caching strategies (page/object caching), and extend analysis to tail-latency metrics to better reflect production behavior.</w:t>
+      </w:r>
+    </w:p>
+    <w:p>
+      <w:pPr>
+        <w:pStyle w:val="Heading1"/>
+      </w:pPr>
+      <w:r>
         <w:t>4. Discussion: Validity and limitations</w:t>
       </w:r>
     </w:p>
     <w:p>
       <w:r>
-        <w:t>This artifact uses local container resource limits to emulate instance-type differences. It does not capture cloud networking variability, EBS behavior, or CPU microarchitecture differences across real EC2 families.</w:t>
+        <w:t>This artifact uses local container resource limits to emulate instance-type differences. It does not capture cloud networking variability, storage behavior, or microarchitectural differences across real EC2 families.</w:t>
       </w:r>
     </w:p>
     <w:p>
@@ -513,7 +526,7 @@
         <w:pStyle w:val="ListBullet"/>
       </w:pPr>
       <w:r>
-        <w:t>ApacheBench primarily measures steady‑state request handling for simple HTTP workloads; it does not model realistic user think time, browser behavior, or mixed request distributions typical of production sites.</w:t>
+        <w:t>ApacheBench measures steady‑state request handling for simple HTTP workloads; it does not model user think time, browser behavior, or realistic mixed request distributions.</w:t>
       </w:r>
     </w:p>
     <w:p>
@@ -521,7 +534,7 @@
         <w:pStyle w:val="ListBullet"/>
       </w:pPr>
       <w:r>
-        <w:t>The benchmark focuses on mean metrics. Tail latency (e.g., p95/p99) can be more indicative of user experience under contention but is not fully characterized here.</w:t>
+        <w:t>The evaluation emphasizes mean metrics. Tail latency (e.g., p95/p99) can better reflect user experience under contention but is not fully characterized here.</w:t>
       </w:r>
     </w:p>
     <w:p>
@@ -529,7 +542,7 @@
         <w:pStyle w:val="ListBullet"/>
       </w:pPr>
       <w:r>
-        <w:t>WordPress performance is sensitive to themes, plugins, and caching configuration. Results obtained with this minimal seeded dataset may differ for content‑heavy sites or with additional plugins enabled.</w:t>
+        <w:t>WordPress performance depends on themes, plugins, and caching configuration; results from a minimal seeded dataset may not generalize to content‑heavy production sites.</w:t>
       </w:r>
     </w:p>
     <w:p>
@@ -537,20 +550,7 @@
         <w:pStyle w:val="ListBullet"/>
       </w:pPr>
       <w:r>
-        <w:t>Because some profiles/scenarios may have incomplete data in earlier runs, conclusions are drawn from the available validated outputs and should be interpreted as indicative trends rather than definitive capacity estimates.</w:t>
-      </w:r>
-    </w:p>
-    <w:p>
-      <w:pPr>
-        <w:pStyle w:val="Heading1"/>
-      </w:pPr>
-      <w:r>
-        <w:t>5. Conclusion and future work</w:t>
-      </w:r>
-    </w:p>
-    <w:p>
-      <w:r>
-        <w:t>This project provides a reproducible artifact for benchmarking a containerized WordPress deployment under controlled resource profiles and standardized workloads. The results show that increasing concurrency can substantially increase latency and does not always translate into proportional throughput gains once service bottlenecks are reached. Future work should validate these findings on real cloud instances, extend the workload model to include mixed request patterns and tail‑latency metrics, and evaluate optimizations such as full‑page caching, object caching (e.g., Redis), database indexing/tuning, and CDN integration to improve performance at scale.</w:t>
+        <w:t>Some historical runs contain incomplete outputs; conclusions are drawn from validated runs and should be interpreted as indicative trends rather than definitive capacity claims.</w:t>
       </w:r>
     </w:p>
     <w:p>
@@ -562,51 +562,33 @@
       </w:r>
     </w:p>
     <w:p>
-      <w:pPr>
-        <w:pStyle w:val="ListNumber"/>
-      </w:pPr>
       <w:r>
-        <w:t>[1] WordPress Docker image documentation, Docker Hub.</w:t>
+        <w:t>[1] Docker Inc., "Docker Desktop Documentation," 2026. [Online]. Available: https://docs.docker.com/desktop/. Accessed: 2026-04-24.</w:t>
       </w:r>
     </w:p>
     <w:p>
-      <w:pPr>
-        <w:pStyle w:val="ListNumber"/>
-      </w:pPr>
       <w:r>
-        <w:t>[2] MySQL Docker image documentation, Docker Hub.</w:t>
+        <w:t>[2] Docker, "WordPress Docker Image," Docker Hub. [Online]. Available: https://hub.docker.com/_/wordpress. Accessed: 2026-04-24.</w:t>
       </w:r>
     </w:p>
     <w:p>
-      <w:pPr>
-        <w:pStyle w:val="ListNumber"/>
-      </w:pPr>
       <w:r>
-        <w:t>[3] Nginx Docker image documentation, Docker Hub.</w:t>
+        <w:t>[3] Docker, "MySQL Docker Image," Docker Hub. [Online]. Available: https://hub.docker.com/_/mysql. Accessed: 2026-04-24.</w:t>
       </w:r>
     </w:p>
     <w:p>
-      <w:pPr>
-        <w:pStyle w:val="ListNumber"/>
-      </w:pPr>
       <w:r>
-        <w:t>[4] Apache HTTP Server Project, ApacheBench (ab) documentation.</w:t>
+        <w:t>[4] Docker, "Nginx Docker Image," Docker Hub. [Online]. Available: https://hub.docker.com/_/nginx. Accessed: 2026-04-24.</w:t>
       </w:r>
     </w:p>
     <w:p>
-      <w:pPr>
-        <w:pStyle w:val="ListNumber"/>
-      </w:pPr>
       <w:r>
-        <w:t>[5] Docker Desktop documentation, Docker Inc.</w:t>
+        <w:t>[5] Apache Software Foundation, "Apache HTTP Server Documentation: ab (ApacheBench)," 2026. [Online]. Available: https://httpd.apache.org/docs/2.4/programs/ab.html. Accessed: 2026-04-24.</w:t>
       </w:r>
     </w:p>
     <w:p>
-      <w:pPr>
-        <w:pStyle w:val="ListNumber"/>
-      </w:pPr>
       <w:r>
-        <w:t>[6] Windows Subsystem for Linux (WSL) documentation, Microsoft.</w:t>
+        <w:t>[6] Microsoft, "Windows Subsystem for Linux Documentation," 2026. [Online]. Available: https://learn.microsoft.com/windows/wsl/. Accessed: 2026-04-24.</w:t>
       </w:r>
     </w:p>
     <w:p>
@@ -1087,6 +1069,13 @@
     <w:name w:val="Normal"/>
     <w:qFormat/>
     <w:rsid w:val="00FC693F"/>
+    <w:pPr>
+      <w:spacing w:line="240" w:lineRule="auto" w:before="0" w:after="0"/>
+    </w:pPr>
+    <w:rPr>
+      <w:rFonts w:ascii="Times New Roman" w:hAnsi="Times New Roman" w:eastAsia="Times New Roman"/>
+      <w:sz w:val="24"/>
+    </w:rPr>
   </w:style>
   <w:style w:type="paragraph" w:styleId="Header">
     <w:name w:val="header"/>

</xml_diff>

<commit_message>
Expand artifact appendix and switch to A4
Add a detailed Software Artifact appendix (dependencies, setup, workflows, expected outputs) and regenerate the report in A4 format.

Made-with: Cursor
</commit_message>
<xml_diff>
--- a/report/CS4296_report_template.docx
+++ b/report/CS4296_report_template.docx
@@ -151,17 +151,17 @@
         <w:tblLook w:firstColumn="1" w:firstRow="1" w:lastColumn="0" w:lastRow="0" w:noHBand="0" w:noVBand="1" w:val="04A0"/>
       </w:tblPr>
       <w:tblGrid>
-        <w:gridCol w:w="1440"/>
-        <w:gridCol w:w="1440"/>
-        <w:gridCol w:w="1440"/>
-        <w:gridCol w:w="1440"/>
-        <w:gridCol w:w="1440"/>
-        <w:gridCol w:w="1440"/>
+        <w:gridCol w:w="1384"/>
+        <w:gridCol w:w="1384"/>
+        <w:gridCol w:w="1384"/>
+        <w:gridCol w:w="1384"/>
+        <w:gridCol w:w="1384"/>
+        <w:gridCol w:w="1384"/>
       </w:tblGrid>
       <w:tr>
         <w:tc>
           <w:tcPr>
-            <w:tcW w:type="dxa" w:w="1440"/>
+            <w:tcW w:type="dxa" w:w="1384"/>
           </w:tcPr>
           <w:p>
             <w:r>
@@ -171,7 +171,7 @@
         </w:tc>
         <w:tc>
           <w:tcPr>
-            <w:tcW w:type="dxa" w:w="1440"/>
+            <w:tcW w:type="dxa" w:w="1384"/>
           </w:tcPr>
           <w:p>
             <w:r>
@@ -181,7 +181,7 @@
         </w:tc>
         <w:tc>
           <w:tcPr>
-            <w:tcW w:type="dxa" w:w="1440"/>
+            <w:tcW w:type="dxa" w:w="1384"/>
           </w:tcPr>
           <w:p>
             <w:r>
@@ -191,7 +191,7 @@
         </w:tc>
         <w:tc>
           <w:tcPr>
-            <w:tcW w:type="dxa" w:w="1440"/>
+            <w:tcW w:type="dxa" w:w="1384"/>
           </w:tcPr>
           <w:p>
             <w:r>
@@ -201,7 +201,7 @@
         </w:tc>
         <w:tc>
           <w:tcPr>
-            <w:tcW w:type="dxa" w:w="1440"/>
+            <w:tcW w:type="dxa" w:w="1384"/>
           </w:tcPr>
           <w:p>
             <w:r>
@@ -211,7 +211,7 @@
         </w:tc>
         <w:tc>
           <w:tcPr>
-            <w:tcW w:type="dxa" w:w="1440"/>
+            <w:tcW w:type="dxa" w:w="1384"/>
           </w:tcPr>
           <w:p>
             <w:r>
@@ -223,7 +223,7 @@
       <w:tr>
         <w:tc>
           <w:tcPr>
-            <w:tcW w:type="dxa" w:w="1440"/>
+            <w:tcW w:type="dxa" w:w="1384"/>
           </w:tcPr>
           <w:p>
             <w:r>
@@ -233,7 +233,7 @@
         </w:tc>
         <w:tc>
           <w:tcPr>
-            <w:tcW w:type="dxa" w:w="1440"/>
+            <w:tcW w:type="dxa" w:w="1384"/>
           </w:tcPr>
           <w:p>
             <w:r>
@@ -243,7 +243,7 @@
         </w:tc>
         <w:tc>
           <w:tcPr>
-            <w:tcW w:type="dxa" w:w="1440"/>
+            <w:tcW w:type="dxa" w:w="1384"/>
           </w:tcPr>
           <w:p>
             <w:r>
@@ -253,7 +253,7 @@
         </w:tc>
         <w:tc>
           <w:tcPr>
-            <w:tcW w:type="dxa" w:w="1440"/>
+            <w:tcW w:type="dxa" w:w="1384"/>
           </w:tcPr>
           <w:p>
             <w:r>
@@ -263,7 +263,7 @@
         </w:tc>
         <w:tc>
           <w:tcPr>
-            <w:tcW w:type="dxa" w:w="1440"/>
+            <w:tcW w:type="dxa" w:w="1384"/>
           </w:tcPr>
           <w:p>
             <w:r>
@@ -273,7 +273,7 @@
         </w:tc>
         <w:tc>
           <w:tcPr>
-            <w:tcW w:type="dxa" w:w="1440"/>
+            <w:tcW w:type="dxa" w:w="1384"/>
           </w:tcPr>
           <w:p>
             <w:r>
@@ -285,7 +285,7 @@
       <w:tr>
         <w:tc>
           <w:tcPr>
-            <w:tcW w:type="dxa" w:w="1440"/>
+            <w:tcW w:type="dxa" w:w="1384"/>
           </w:tcPr>
           <w:p>
             <w:r>
@@ -295,7 +295,7 @@
         </w:tc>
         <w:tc>
           <w:tcPr>
-            <w:tcW w:type="dxa" w:w="1440"/>
+            <w:tcW w:type="dxa" w:w="1384"/>
           </w:tcPr>
           <w:p>
             <w:r>
@@ -305,7 +305,7 @@
         </w:tc>
         <w:tc>
           <w:tcPr>
-            <w:tcW w:type="dxa" w:w="1440"/>
+            <w:tcW w:type="dxa" w:w="1384"/>
           </w:tcPr>
           <w:p>
             <w:r>
@@ -315,7 +315,7 @@
         </w:tc>
         <w:tc>
           <w:tcPr>
-            <w:tcW w:type="dxa" w:w="1440"/>
+            <w:tcW w:type="dxa" w:w="1384"/>
           </w:tcPr>
           <w:p>
             <w:r>
@@ -325,7 +325,7 @@
         </w:tc>
         <w:tc>
           <w:tcPr>
-            <w:tcW w:type="dxa" w:w="1440"/>
+            <w:tcW w:type="dxa" w:w="1384"/>
           </w:tcPr>
           <w:p>
             <w:r>
@@ -335,7 +335,7 @@
         </w:tc>
         <w:tc>
           <w:tcPr>
-            <w:tcW w:type="dxa" w:w="1440"/>
+            <w:tcW w:type="dxa" w:w="1384"/>
           </w:tcPr>
           <w:p>
             <w:r>
@@ -347,7 +347,7 @@
       <w:tr>
         <w:tc>
           <w:tcPr>
-            <w:tcW w:type="dxa" w:w="1440"/>
+            <w:tcW w:type="dxa" w:w="1384"/>
           </w:tcPr>
           <w:p>
             <w:r>
@@ -357,7 +357,7 @@
         </w:tc>
         <w:tc>
           <w:tcPr>
-            <w:tcW w:type="dxa" w:w="1440"/>
+            <w:tcW w:type="dxa" w:w="1384"/>
           </w:tcPr>
           <w:p>
             <w:r>
@@ -367,7 +367,7 @@
         </w:tc>
         <w:tc>
           <w:tcPr>
-            <w:tcW w:type="dxa" w:w="1440"/>
+            <w:tcW w:type="dxa" w:w="1384"/>
           </w:tcPr>
           <w:p>
             <w:r>
@@ -377,7 +377,7 @@
         </w:tc>
         <w:tc>
           <w:tcPr>
-            <w:tcW w:type="dxa" w:w="1440"/>
+            <w:tcW w:type="dxa" w:w="1384"/>
           </w:tcPr>
           <w:p>
             <w:r>
@@ -387,7 +387,7 @@
         </w:tc>
         <w:tc>
           <w:tcPr>
-            <w:tcW w:type="dxa" w:w="1440"/>
+            <w:tcW w:type="dxa" w:w="1384"/>
           </w:tcPr>
           <w:p>
             <w:r>
@@ -397,7 +397,7 @@
         </w:tc>
         <w:tc>
           <w:tcPr>
-            <w:tcW w:type="dxa" w:w="1440"/>
+            <w:tcW w:type="dxa" w:w="1384"/>
           </w:tcPr>
           <w:p>
             <w:r>
@@ -601,22 +601,163 @@
         <w:pStyle w:val="Heading1"/>
       </w:pPr>
       <w:r>
-        <w:t>Artifact Appendix (reproducibility)</w:t>
+        <w:t>Artifact Appendix (Software Artifact)</w:t>
       </w:r>
     </w:p>
     <w:p>
       <w:r>
-        <w:t>Repository: https://github.com/hansz109/cs4296-project-</w:t>
+        <w:t>Artifact repository (public GitHub): https://github.com/hansz109/cs4296-project-</w:t>
+      </w:r>
+    </w:p>
+    <w:p>
+      <w:pPr>
+        <w:pStyle w:val="Heading2"/>
+      </w:pPr>
+      <w:r>
+        <w:t>A.1 Artifact overview</w:t>
       </w:r>
     </w:p>
     <w:p>
       <w:r>
-        <w:t>Prerequisites: Docker Desktop, WSL Ubuntu, Python 3.11+</w:t>
+        <w:t>This software artifact contains the complete workflow used in this project, including: (i) infrastructure-as-code for deploying WordPress via Docker Compose, (ii) scripts to seed content and run workloads, (iii) raw benchmark outputs and metadata, and (iv) analysis scripts that aggregate results into CSV summaries and figures.</w:t>
+      </w:r>
+    </w:p>
+    <w:p>
+      <w:pPr>
+        <w:pStyle w:val="Heading2"/>
+      </w:pPr>
+      <w:r>
+        <w:t>A.2 Artifact contents (what is included)</w:t>
+      </w:r>
+    </w:p>
+    <w:p>
+      <w:pPr>
+        <w:pStyle w:val="ListBullet"/>
+      </w:pPr>
+      <w:r>
+        <w:t>Source code and scripts under `scripts/` to start/stop the stack, seed WordPress, run benchmarks, and generate the report.</w:t>
+      </w:r>
+    </w:p>
+    <w:p>
+      <w:pPr>
+        <w:pStyle w:val="ListBullet"/>
+      </w:pPr>
+      <w:r>
+        <w:t>Deployment configuration (`docker-compose.yml` and `nginx/` config).</w:t>
+      </w:r>
+    </w:p>
+    <w:p>
+      <w:pPr>
+        <w:pStyle w:val="ListBullet"/>
+      </w:pPr>
+      <w:r>
+        <w:t>Experiment plan (`experiments/matrix.yaml`).</w:t>
+      </w:r>
+    </w:p>
+    <w:p>
+      <w:pPr>
+        <w:pStyle w:val="ListBullet"/>
+      </w:pPr>
+      <w:r>
+        <w:t>Raw outputs under `experiments/results/` (ApacheBench logs and per-run `meta.txt`).</w:t>
+      </w:r>
+    </w:p>
+    <w:p>
+      <w:pPr>
+        <w:pStyle w:val="ListBullet"/>
+      </w:pPr>
+      <w:r>
+        <w:t>Aggregated outputs under `experiments/summary/` (CSV + PNG plots, including a combined S1/S2/S3 figure).</w:t>
+      </w:r>
+    </w:p>
+    <w:p>
+      <w:pPr>
+        <w:pStyle w:val="ListBullet"/>
+      </w:pPr>
+      <w:r>
+        <w:t>A Word report template generated from the latest summaries (`report/CS4296_report_template.docx`).</w:t>
+      </w:r>
+    </w:p>
+    <w:p>
+      <w:pPr>
+        <w:pStyle w:val="Heading2"/>
+      </w:pPr>
+      <w:r>
+        <w:t>A.3 Dependencies (software/hardware)</w:t>
       </w:r>
     </w:p>
     <w:p>
       <w:r>
-        <w:t>Reproduce (high level):</w:t>
+        <w:t>Hardware (minimum recommended):</w:t>
+      </w:r>
+    </w:p>
+    <w:p>
+      <w:pPr>
+        <w:pStyle w:val="ListBullet"/>
+      </w:pPr>
+      <w:r>
+        <w:t>x86-64 machine with at least 8 GB RAM (16 GB recommended for stable runs at higher concurrency).</w:t>
+      </w:r>
+    </w:p>
+    <w:p>
+      <w:pPr>
+        <w:pStyle w:val="ListBullet"/>
+      </w:pPr>
+      <w:r>
+        <w:t>At least 4 logical CPU cores recommended.</w:t>
+      </w:r>
+    </w:p>
+    <w:p>
+      <w:pPr>
+        <w:pStyle w:val="ListBullet"/>
+      </w:pPr>
+      <w:r>
+        <w:t>Disk space: a few GB for Docker images, containers, and result logs.</w:t>
+      </w:r>
+    </w:p>
+    <w:p>
+      <w:r>
+        <w:t>Software:</w:t>
+      </w:r>
+    </w:p>
+    <w:p>
+      <w:pPr>
+        <w:pStyle w:val="ListBullet"/>
+      </w:pPr>
+      <w:r>
+        <w:t>Windows 10/11 with Docker Desktop (Linux containers).</w:t>
+      </w:r>
+    </w:p>
+    <w:p>
+      <w:pPr>
+        <w:pStyle w:val="ListBullet"/>
+      </w:pPr>
+      <w:r>
+        <w:t>Python 3.11+ (used for analysis and report generation).</w:t>
+      </w:r>
+    </w:p>
+    <w:p>
+      <w:pPr>
+        <w:pStyle w:val="ListBullet"/>
+      </w:pPr>
+      <w:r>
+        <w:t>Git (to clone and reproduce the versioned workflow).</w:t>
+      </w:r>
+    </w:p>
+    <w:p>
+      <w:pPr>
+        <w:pStyle w:val="ListBullet"/>
+      </w:pPr>
+      <w:r>
+        <w:t>Optional: WSL2 Ubuntu if using WSL-based load generation; otherwise the artifact supports a containerized load generator.</w:t>
+      </w:r>
+    </w:p>
+    <w:p>
+      <w:pPr>
+        <w:pStyle w:val="Heading2"/>
+      </w:pPr>
+      <w:r>
+        <w:t>A.4 Setup instructions</w:t>
       </w:r>
     </w:p>
     <w:p>
@@ -624,7 +765,7 @@
         <w:pStyle w:val="ListNumber"/>
       </w:pPr>
       <w:r>
-        <w:t>1) Start stack: .\scripts\up_profile.ps1 -Profile general</w:t>
+        <w:t>1) Clone: `git clone https://github.com/hansz109/cs4296-project-.git`</w:t>
       </w:r>
     </w:p>
     <w:p>
@@ -632,7 +773,7 @@
         <w:pStyle w:val="ListNumber"/>
       </w:pPr>
       <w:r>
-        <w:t>2) Seed content: .\scripts\seed_wp.ps1</w:t>
+        <w:t>2) Enter repo: `cd cs4296-wordpress-benchmark`</w:t>
       </w:r>
     </w:p>
     <w:p>
@@ -640,7 +781,7 @@
         <w:pStyle w:val="ListNumber"/>
       </w:pPr>
       <w:r>
-        <w:t>3) Install ab in WSL: .\scripts\install_ab_wsl.ps1</w:t>
+        <w:t>3) Create venv + deps: `python -m venv .venv` then `.\.venv\Scripts\python.exe -m pip install -r requirements.txt`</w:t>
       </w:r>
     </w:p>
     <w:p>
@@ -648,7 +789,20 @@
         <w:pStyle w:val="ListNumber"/>
       </w:pPr>
       <w:r>
-        <w:t>4) Run benchmarks: .\scripts\run_bench_wsl.ps1 -Profile &lt;general|compute|memory&gt; -Scenario &lt;S1|S2|S3&gt; -Repeat 3</w:t>
+        <w:t>4) Ensure Docker Desktop is running (Docker engine reachable).</w:t>
+      </w:r>
+    </w:p>
+    <w:p>
+      <w:pPr>
+        <w:pStyle w:val="Heading2"/>
+      </w:pPr>
+      <w:r>
+        <w:t>A.5 Running the experiments (workflows)</w:t>
+      </w:r>
+    </w:p>
+    <w:p>
+      <w:r>
+        <w:t>The artifact provides a scripted workflow to start the stack, seed WordPress, run the benchmark scenarios (S1–S3), and store raw outputs under `experiments/results/`.</w:t>
       </w:r>
     </w:p>
     <w:p>
@@ -656,12 +810,81 @@
         <w:pStyle w:val="ListNumber"/>
       </w:pPr>
       <w:r>
-        <w:t>5) Analyze: python scripts\analyze_results.py --results_dir experiments\results --out_dir experiments\summary</w:t>
+        <w:t>1) Start a profile: `.\scripts\up_profile.ps1 -Profile general` (or compute/memory).</w:t>
+      </w:r>
+    </w:p>
+    <w:p>
+      <w:pPr>
+        <w:pStyle w:val="ListNumber"/>
+      </w:pPr>
+      <w:r>
+        <w:t>2) Seed content: `wsl bash scripts/seed_wp.sh` (or use `.\scripts\seed_wp.ps1` if preferred).</w:t>
+      </w:r>
+    </w:p>
+    <w:p>
+      <w:pPr>
+        <w:pStyle w:val="ListNumber"/>
+      </w:pPr>
+      <w:r>
+        <w:t>3) Run benchmarks: Use `.\scripts\run_bench_docker.ps1 -Profile &lt;general|compute|memory&gt; -Scenario &lt;S1|S2|S3&gt; -Repeat 3`.</w:t>
+      </w:r>
+    </w:p>
+    <w:p>
+      <w:pPr>
+        <w:pStyle w:val="ListNumber"/>
+      </w:pPr>
+      <w:r>
+        <w:t xml:space="preserve">   (This uses a portable containerized ApacheBench image to avoid WSL↔Windows networking instability.)</w:t>
+      </w:r>
+    </w:p>
+    <w:p>
+      <w:pPr>
+        <w:pStyle w:val="ListNumber"/>
+      </w:pPr>
+      <w:r>
+        <w:t>4) Repeat step 3 for S1, S2, S3 and for each profile you wish to evaluate.</w:t>
+      </w:r>
+    </w:p>
+    <w:p>
+      <w:pPr>
+        <w:pStyle w:val="Heading2"/>
+      </w:pPr>
+      <w:r>
+        <w:t>A.6 Analysis and expected outputs (validation)</w:t>
       </w:r>
     </w:p>
     <w:p>
       <w:r>
-        <w:t>Expected outputs:</w:t>
+        <w:t>After benchmarks complete, run the analysis pipeline to parse ApacheBench logs and generate summary CSVs and plots.</w:t>
+      </w:r>
+    </w:p>
+    <w:p>
+      <w:pPr>
+        <w:pStyle w:val="ListNumber"/>
+      </w:pPr>
+      <w:r>
+        <w:t>1) Analyze: `.\.venv\Scripts\python.exe scripts\analyze_results.py --results_dir experiments\results --out_dir experiments\summary`</w:t>
+      </w:r>
+    </w:p>
+    <w:p>
+      <w:pPr>
+        <w:pStyle w:val="ListNumber"/>
+      </w:pPr>
+      <w:r>
+        <w:t>2) (Optional) Combined S1/S2/S3 plot: `.\.venv\Scripts\python.exe scripts\make_combined_figure.py --summary_csv experiments/summary/ab_summary_by_scenario.csv --out experiments/summary/s1_s2_s3_combined.png`</w:t>
+      </w:r>
+    </w:p>
+    <w:p>
+      <w:pPr>
+        <w:pStyle w:val="ListNumber"/>
+      </w:pPr>
+      <w:r>
+        <w:t>3) Regenerate report: `.\.venv\Scripts\python.exe scripts\generate_word_report.py --auto_write --paper a4 ...`</w:t>
+      </w:r>
+    </w:p>
+    <w:p>
+      <w:r>
+        <w:t>Expected outputs to validate correctness:</w:t>
       </w:r>
     </w:p>
     <w:p>
@@ -669,7 +892,7 @@
         <w:pStyle w:val="ListBullet"/>
       </w:pPr>
       <w:r>
-        <w:t>- experiments\results\&lt;RUN_ID&gt;\ab_*.txt, meta.txt, docker_stats.csv</w:t>
+        <w:t>`experiments/results/&lt;RUN_ID&gt;/meta.txt` with scenario/profile metadata.</w:t>
       </w:r>
     </w:p>
     <w:p>
@@ -677,7 +900,7 @@
         <w:pStyle w:val="ListBullet"/>
       </w:pPr>
       <w:r>
-        <w:t>- experiments\summary\ab_summary_by_profile_scenario.csv</w:t>
+        <w:t>`experiments/results/&lt;RUN_ID&gt;/ab_*.txt` containing lines such as `Requests per second:` and `Time per request:`.</w:t>
       </w:r>
     </w:p>
     <w:p>
@@ -685,7 +908,7 @@
         <w:pStyle w:val="ListBullet"/>
       </w:pPr>
       <w:r>
-        <w:t>- experiments\summary\throughput_by_profile_scenario.png</w:t>
+        <w:t>`experiments/summary/ab_parsed.csv` (parsed per-file metrics).</w:t>
       </w:r>
     </w:p>
     <w:p>
@@ -693,11 +916,45 @@
         <w:pStyle w:val="ListBullet"/>
       </w:pPr>
       <w:r>
-        <w:t>- experiments\summary\latency_by_profile_scenario.png</w:t>
+        <w:t>`experiments/summary/ab_summary_by_profile_scenario.csv` and `ab_summary_by_scenario.csv` (aggregated metrics).</w:t>
+      </w:r>
+    </w:p>
+    <w:p>
+      <w:pPr>
+        <w:pStyle w:val="ListBullet"/>
+      </w:pPr>
+      <w:r>
+        <w:t>`experiments/summary/s1_s2_s3_combined.png` (single figure combining S1–S3).</w:t>
+      </w:r>
+    </w:p>
+    <w:p>
+      <w:pPr>
+        <w:pStyle w:val="ListBullet"/>
+      </w:pPr>
+      <w:r>
+        <w:t>Updated `report/CS4296_report_template.docx` embedding the latest figures and tables.</w:t>
+      </w:r>
+    </w:p>
+    <w:p>
+      <w:pPr>
+        <w:pStyle w:val="Heading2"/>
+      </w:pPr>
+      <w:r>
+        <w:t>A.7 Notes on portability and workflow automation</w:t>
+      </w:r>
+    </w:p>
+    <w:p>
+      <w:r>
+        <w:t>To improve portability, the artifact supports a containerized load generator (ApacheBench inside an `httpd` container) and a Python-based analysis/report pipeline. This reduces host-specific dependencies and standardizes the evaluation workflow.</w:t>
+      </w:r>
+    </w:p>
+    <w:p>
+      <w:r>
+        <w:t>Optional self-contained packaging (encouraged but not required): the entire stack already runs via Docker Compose. A reviewer can reproduce the experiments by starting Docker Desktop and running the provided scripts without installing WordPress/MySQL/Nginx directly on the host.</w:t>
       </w:r>
     </w:p>
     <w:sectPr>
-      <w:pgSz w:w="12240" w:h="15840"/>
+      <w:pgSz w:w="11906" w:h="16838"/>
       <w:pgMar w:top="1440" w:right="1800" w:bottom="1440" w:left="1800" w:header="720" w:footer="720" w:gutter="0"/>
       <w:cols w:space="720"/>
       <w:docGrid w:linePitch="360"/>

</xml_diff>